<commit_message>
Relatório técnico: revisão 04 para os firmwares 1.6.14 e 1.6.15
Projeção do azimute com o sinal corrigido, ZUPT com limiar de 0,1 °/s
(bordas, vibração, viés que muda com o eixo parado, passeio medido),
giroscópio em ±1000 °/s com descarte por salto, parâmetros da Tabela 4,
novos cenários da Tabela 8 e limitações pendentes atualizadas.

Co-Authored-By: Claude Opus 5.5 <noreply@anthropic.com>
Claude-Session: https://claude.ai/code/session_01VvvtJDPvh4mDoSVpkHza1d
</commit_message>
<xml_diff>
--- a/docs/relatorio-tecnico-inclinometro.docx
+++ b/docs/relatorio-tecnico-inclinometro.docx
@@ -1163,6 +1163,120 @@
           </w:p>
         </w:tc>
       </w:tr>
+      <w:tr>
+        <w:tc>
+          <w:tcPr>
+            <w:tcW w:type="dxa" w:w="1400"/>
+            <w:tcMar>
+              <w:top w:type="dxa" w:w="60"/>
+              <w:left w:type="dxa" w:w="100"/>
+              <w:bottom w:type="dxa" w:w="60"/>
+              <w:right w:type="dxa" w:w="100"/>
+            </w:tcMar>
+            <w:vAlign w:val="center"/>
+          </w:tcPr>
+          <w:p>
+            <w:pPr>
+              <w:spacing w:line="240" w:lineRule="auto"/>
+              <w:jc w:val="left"/>
+            </w:pPr>
+            <w:r>
+              <w:rPr>
+                <w:rFonts w:ascii="Times New Roman" w:cs="Times New Roman" w:eastAsia="Times New Roman" w:hAnsi="Times New Roman"/>
+                <w:b w:val="false"/>
+                <w:bCs w:val="false"/>
+                <w:sz w:val="20"/>
+                <w:szCs w:val="20"/>
+              </w:rPr>
+              <w:t>04</w:t>
+            </w:r>
+          </w:p>
+        </w:tc>
+        <w:tc>
+          <w:tcPr>
+            <w:tcW w:type="dxa" w:w="1600"/>
+            <w:tcMar>
+              <w:top w:type="dxa" w:w="60"/>
+              <w:left w:type="dxa" w:w="100"/>
+              <w:bottom w:type="dxa" w:w="60"/>
+              <w:right w:type="dxa" w:w="100"/>
+            </w:tcMar>
+            <w:vAlign w:val="center"/>
+          </w:tcPr>
+          <w:p>
+            <w:pPr>
+              <w:spacing w:line="240" w:lineRule="auto"/>
+              <w:jc w:val="left"/>
+            </w:pPr>
+            <w:r>
+              <w:rPr>
+                <w:rFonts w:ascii="Times New Roman" w:cs="Times New Roman" w:eastAsia="Times New Roman" w:hAnsi="Times New Roman"/>
+                <w:b w:val="false"/>
+                <w:bCs w:val="false"/>
+                <w:sz w:val="20"/>
+                <w:szCs w:val="20"/>
+              </w:rPr>
+              <w:t>14/10/2026</w:t>
+            </w:r>
+          </w:p>
+        </w:tc>
+        <w:tc>
+          <w:tcPr>
+            <w:tcW w:type="dxa" w:w="4670"/>
+            <w:tcMar>
+              <w:top w:type="dxa" w:w="60"/>
+              <w:left w:type="dxa" w:w="100"/>
+              <w:bottom w:type="dxa" w:w="60"/>
+              <w:right w:type="dxa" w:w="100"/>
+            </w:tcMar>
+            <w:vAlign w:val="center"/>
+          </w:tcPr>
+          <w:p>
+            <w:pPr>
+              <w:spacing w:line="240" w:lineRule="auto"/>
+              <w:jc w:val="left"/>
+            </w:pPr>
+            <w:r>
+              <w:rPr>
+                <w:rFonts w:ascii="Times New Roman" w:cs="Times New Roman" w:eastAsia="Times New Roman" w:hAnsi="Times New Roman"/>
+                <w:b w:val="false"/>
+                <w:bCs w:val="false"/>
+                <w:sz w:val="20"/>
+                <w:szCs w:val="20"/>
+              </w:rPr>
+              <w:t>Atualização para os firmwares 1.6.14 e 1.6.15, após o segundo ensaio em bancada: giro de azimute feito à mão (limiar de "parado" de 1,0 para 0,1 °/s, bordas do giro e limiar adaptativo à vibração); reconhecimento do viés do giroscópio que muda com o eixo parado e limiar adaptado à estabilidade do próprio giroscópio; correção do sinal da compensação de tilt do azimute; fundo de escala do giroscópio de ±250 para ±1000 °/s, com descarte de amostras de salto impossível (seções 2.1, 4.2, 4.2.1, 4.2.2, 7.1 e 7.4).</w:t>
+            </w:r>
+          </w:p>
+        </w:tc>
+        <w:tc>
+          <w:tcPr>
+            <w:tcW w:type="dxa" w:w="1400"/>
+            <w:tcMar>
+              <w:top w:type="dxa" w:w="60"/>
+              <w:left w:type="dxa" w:w="100"/>
+              <w:bottom w:type="dxa" w:w="60"/>
+              <w:right w:type="dxa" w:w="100"/>
+            </w:tcMar>
+            <w:vAlign w:val="center"/>
+          </w:tcPr>
+          <w:p>
+            <w:pPr>
+              <w:spacing w:line="240" w:lineRule="auto"/>
+              <w:jc w:val="left"/>
+            </w:pPr>
+            <w:r>
+              <w:rPr>
+                <w:rFonts w:ascii="Times New Roman" w:cs="Times New Roman" w:eastAsia="Times New Roman" w:hAnsi="Times New Roman"/>
+                <w:b w:val="false"/>
+                <w:bCs w:val="false"/>
+                <w:sz w:val="20"/>
+                <w:szCs w:val="20"/>
+              </w:rPr>
+              <w:t>[NOME DO AUTOR]</w:t>
+            </w:r>
+          </w:p>
+        </w:tc>
+      </w:tr>
     </w:tbl>
     <w:p>
       <w:pPr>
@@ -4714,7 +4828,7 @@
                 <w:sz w:val="20"/>
                 <w:szCs w:val="20"/>
               </w:rPr>
-              <w:t xml:space="preserve">±250 °/s</w:t>
+              <w:t>±1000 °/s</w:t>
             </w:r>
           </w:p>
         </w:tc>
@@ -4742,7 +4856,7 @@
                 <w:sz w:val="20"/>
                 <w:szCs w:val="20"/>
               </w:rPr>
-              <w:t xml:space="preserve">Cobre com folga a velocidade do motor (20-30 °/s) e a vibração típica do mastro (~1 °/s)</w:t>
+              <w:t>Giros de azimute feitos à mão chegam a ~350 °/s (90° em 0,5 s); até a versão 1.6.14 era ±250 °/s, que saturava nesses giros</w:t>
             </w:r>
           </w:p>
         </w:tc>
@@ -4800,7 +4914,7 @@
                 <w:sz w:val="20"/>
                 <w:szCs w:val="20"/>
               </w:rPr>
-              <w:t xml:space="preserve">131 LSB/(°/s)</w:t>
+              <w:t>32,8 LSB/(°/s)</w:t>
             </w:r>
           </w:p>
         </w:tc>
@@ -4828,7 +4942,7 @@
                 <w:sz w:val="20"/>
                 <w:szCs w:val="20"/>
               </w:rPr>
-              <w:t xml:space="preserve">Conforme datasheet do fabricante</w:t>
+              <w:t>Conforme datasheet do fabricante; resolução de 0,03 °/s, abaixo do ruído do sensor (~0,05 °/s por amostra)</w:t>
             </w:r>
           </w:p>
         </w:tc>
@@ -6883,7 +6997,7 @@
           <w:sz w:val="20"/>
           <w:szCs w:val="20"/>
         </w:rPr>
-        <w:t xml:space="preserve">ω_pan = g_z · cos(θ) − g_y · sen(θ),   com   θ = atan2(a_y, a_z)</w:t>
+        <w:t>ω_pan = g_z · cos(θ) + g_y · sen(θ),   com   θ = atan2(a_y, a_z)</w:t>
       </w:r>
     </w:p>
     <w:p>
@@ -6903,22 +7017,6 @@
     </w:p>
     <w:p>
       <w:pPr>
-        <w:pStyle w:val="Heading3"/>
-        <w:spacing w:after="160" w:before="280"/>
-      </w:pPr>
-      <w:r>
-        <w:rPr>
-          <w:rFonts w:ascii="Times New Roman" w:cs="Times New Roman" w:eastAsia="Times New Roman" w:hAnsi="Times New Roman"/>
-          <w:i/>
-          <w:iCs/>
-          <w:sz w:val="24"/>
-          <w:szCs w:val="24"/>
-        </w:rPr>
-        <w:t xml:space="preserve">4.2.1 Atualização de taxa zero (ZUPT)</w:t>
-      </w:r>
-    </w:p>
-    <w:p>
-      <w:pPr>
         <w:spacing w:after="200" w:before="0" w:line="360" w:lineRule="auto"/>
         <w:ind w:firstLine="709"/>
         <w:jc w:val="both"/>
@@ -6929,7 +7027,23 @@
           <w:sz w:val="24"/>
           <w:szCs w:val="24"/>
         </w:rPr>
-        <w:t xml:space="preserve">A cada janela de tempo fixa (1000 ms), calcula-se a média das leituras brutas g_y e g_z ao longo da janela. Se essa média estiver suficientemente próxima do viés (bias) corrente estimado para esses dois eixos — a uma distância inferior a um limiar de 1,0 °/s —, a janela é classificada como "parada" e o viés de cada eixo é atualizado por uma média móvel exponencial em direção ao valor observado, com um fator de suavização de 0,1. O critério utiliza a média da janela, e não sua dispersão (variância), justamente porque vibração mecânica tem média aproximadamente nula: o mastro pode estar balançando sob a ação do vento e a janela ainda ser corretamente reconhecida como parada, sem que a vibração seja confundida com movimento de pan.</w:t>
+        <w:t>A expressão decorre diretamente da física do sensor: em repouso, o acelerômetro mede a direção vertical (para cima) nos eixos do próprio chip, (0, sen θ, cos θ), e o giroscópio mede a velocidade angular nos mesmos eixos; uma rotação de azimute de velocidade Ω em torno da vertical aparece, portanto, como g_y = Ω·sen θ e g_z = Ω·cos θ, e o produto escalar entre os dois vetores recupera Ω independentemente de como a placa foi montada. Até a versão 1.6.14 o termo de g_y tinha o sinal invertido (−g_y·sen θ): a taxa calculada saía multiplicada por cos(2θ) — cerca de 6% a menos a 10° de inclinação, metade a 30°, zero a 45° e com o sentido invertido acima disso. O defeito não aparecia nos testes porque o sensor simulado continha o mesmo sinal invertido; ele foi corrigido na versão 1.6.15, e os simuladores passaram a gerar as leituras pela física (seção 7.1).</w:t>
+      </w:r>
+    </w:p>
+    <w:p>
+      <w:pPr>
+        <w:pStyle w:val="Heading3"/>
+        <w:spacing w:after="160" w:before="280"/>
+      </w:pPr>
+      <w:r>
+        <w:rPr>
+          <w:rFonts w:ascii="Times New Roman" w:cs="Times New Roman" w:eastAsia="Times New Roman" w:hAnsi="Times New Roman"/>
+          <w:i/>
+          <w:iCs/>
+          <w:sz w:val="24"/>
+          <w:szCs w:val="24"/>
+        </w:rPr>
+        <w:t xml:space="preserve">4.2.1 Atualização de taxa zero (ZUPT)</w:t>
       </w:r>
     </w:p>
     <w:p>
@@ -6944,6 +7058,21 @@
           <w:sz w:val="24"/>
           <w:szCs w:val="24"/>
         </w:rPr>
+        <w:t>A cada janela de tempo fixa (1000 ms), calcula-se a média das leituras brutas g_y e g_z ao longo da janela. Se essa média estiver suficientemente próxima do viés (bias) corrente estimado para esses dois eixos — a uma distância inferior a um limiar de 0,1 °/s, que é o piso de um limiar adaptativo descrito adiante —, a janela é classificada como "parada" e o viés de cada eixo é atualizado por uma média móvel exponencial em direção ao valor observado, com um fator de suavização de 0,3. O critério utiliza a média da janela, e não sua dispersão (variância), justamente porque vibração mecânica tem média aproximadamente nula: o mastro pode estar balançando sob a ação do vento e a janela ainda ser corretamente reconhecida como parada, sem que a vibração seja confundida com movimento de pan.</w:t>
+      </w:r>
+    </w:p>
+    <w:p>
+      <w:pPr>
+        <w:spacing w:after="200" w:before="0" w:line="360" w:lineRule="auto"/>
+        <w:ind w:firstLine="709"/>
+        <w:jc w:val="both"/>
+      </w:pPr>
+      <w:r>
+        <w:rPr>
+          <w:rFonts w:ascii="Times New Roman" w:cs="Times New Roman" w:eastAsia="Times New Roman" w:hAnsi="Times New Roman"/>
+          <w:sz w:val="24"/>
+          <w:szCs w:val="24"/>
+        </w:rPr>
         <w:t xml:space="preserve">O viés é estimado por eixo, no referencial do próprio sensor (b_y e b_z), e só então descontado das leituras antes da projeção na vertical:</w:t>
       </w:r>
     </w:p>
@@ -6958,7 +7087,7 @@
           <w:sz w:val="20"/>
           <w:szCs w:val="20"/>
         </w:rPr>
-        <w:t xml:space="preserve">ω_pan = (g_z − b_z) · cos(θ) − (g_y − b_y) · sen(θ)</w:t>
+        <w:t>ω_pan = (g_z − b_z) · cos(θ) + (g_y − b_y) · sen(θ)</w:t>
       </w:r>
       <w:r>
         <w:br/>
@@ -6970,7 +7099,7 @@
           <w:sz w:val="20"/>
           <w:szCs w:val="20"/>
         </w:rPr>
-        <w:t xml:space="preserve">janela parada  ⇔  √[(ḡ_y − b_y)² + (ḡ_z − b_z)²] &lt; 1,0 °/s</w:t>
+        <w:t>janela parada  ⇔  √[(ḡ_y − b_y)² + (ḡ_z − b_z)²] &lt; limiar  (≥ 0,1 °/s)</w:t>
       </w:r>
     </w:p>
     <w:p>
@@ -6985,7 +7114,7 @@
           <w:sz w:val="24"/>
           <w:szCs w:val="24"/>
         </w:rPr>
-        <w:t xml:space="preserve">em que ḡ_y e ḡ_z são as médias da janela. Até a versão 1.6.0, o viés era estimado sobre ω_pan já projetado, o que se mostrou incorreto: o viés de fábrica é fixo nos eixos do chip e, projetado na vertical, vale b_z·cos(θ) − b_y·sen(θ) — ou seja, muda com a inclinação. Uma mudança de posição da placa deslocava o viés aprendido em alguns graus por segundo, acima do limiar; a partir daí toda janela parada era rejeitada, o viés nunca mais se corrigia e o erro residual era integrado indefinidamente, até a leitura cravar no limite da faixa de azimute (±90°), sem recuperação nem com o retorno da placa à posição original. O defeito foi observado em bancada e corrigido na versão 1.6.1 (seção 7.1). A distância usada no teste vale exatamente |ω_pan| para uma rotação de azimute em qualquer inclinação, de modo que o limiar mantém o significado de graus por segundo de azimute; e o movimento de tilt, que ocorre em torno do eixo X, não aparece em g_y nem em g_z e não tira a janela da condição de parada.</w:t>
+        <w:t>em que ḡ_y e ḡ_z são as médias da janela. Até a versão 1.6.0, o viés era estimado sobre ω_pan já projetado, o que se mostrou incorreto: o viés de fábrica é fixo nos eixos do chip e, projetado na vertical, vale b_z·cos(θ) + b_y·sen(θ) — ou seja, muda com a inclinação. Uma mudança de posição da placa deslocava o viés aprendido em alguns graus por segundo, acima do limiar; a partir daí toda janela parada era rejeitada, o viés nunca mais se corrigia e o erro residual era integrado indefinidamente, até a leitura cravar no limite da faixa de azimute (±90°), sem recuperação nem com o retorno da placa à posição original. O defeito foi observado em bancada e corrigido na versão 1.6.1 (seção 7.1). A distância usada no teste vale exatamente |ω_pan| para uma rotação de azimute em qualquer inclinação, de modo que o limiar mantém o significado de graus por segundo de azimute; e o movimento de tilt, que ocorre em torno do eixo X, não aparece em g_y nem em g_z e não tira a janela da condição de parada.</w:t>
       </w:r>
     </w:p>
     <w:p>
@@ -7014,7 +7143,7 @@
           <w:sz w:val="20"/>
           <w:szCs w:val="20"/>
         </w:rPr>
-        <w:t xml:space="preserve">deslocamento_mínimo ≈ limiar × janela = 1,0 °/s × 1,0 s = 1°</w:t>
+        <w:t>deslocamento_mínimo ≈ limiar × janela = 0,1 °/s × 1,0 s = 0,1°</w:t>
       </w:r>
     </w:p>
     <w:p>
@@ -7029,7 +7158,52 @@
           <w:sz w:val="24"/>
           <w:szCs w:val="24"/>
         </w:rPr>
-        <w:t xml:space="preserve">é descartado como ruído — um compromisso ajustável pelos parâmetros de janela e limiar, listados na Tabela 4.</w:t>
+        <w:t>é descartado como ruído — um compromisso ajustável pelos parâmetros de janela e limiar, listados na Tabela 4. Até a versão 1.6.13 o limiar era de 1,0 °/s e o piso, de cerca de 1°.</w:t>
+      </w:r>
+    </w:p>
+    <w:p>
+      <w:pPr>
+        <w:spacing w:after="200" w:before="0" w:line="360" w:lineRule="auto"/>
+        <w:ind w:firstLine="709"/>
+        <w:jc w:val="both"/>
+      </w:pPr>
+      <w:r>
+        <w:rPr>
+          <w:rFonts w:ascii="Times New Roman" w:cs="Times New Roman" w:eastAsia="Times New Roman" w:hAnsi="Times New Roman"/>
+          <w:sz w:val="24"/>
+          <w:szCs w:val="24"/>
+        </w:rPr>
+        <w:t>Giro feito à mão (versão 1.6.14). O limiar de 1,0 °/s se mostrou inadequado no primeiro uso em bancada com o eixo girado à mão: um giro lento, com partida e parada suaves, caía inteiro abaixo dele — cada janela era tida como parada, o que fora integrado nela era apagado, e parte da velocidade do giro era absorvida pelo viés, que depois puxava a leitura para o lado contrário (−0,6° após um giro positivo, com cerca de 1 min para estabilizar). A versão 1.6.14 baixou o limiar para 0,1 °/s; deixou de atualizar o viés em janelas classificadas como movimento; passou a reconhecer as bordas suaves do giro pela forma — mesmo sentido e velocidade crescendo ou caindo janela a janela —, devolvendo o que foi cancelado nelas e desfazendo o que ensinaram ao viés; e fez o limiar crescer com a vibração medida na janela (pela diferença entre amostras brutas sucessivas), porque sob vibração a média de uma janela não se anula — em especial perto de submúltiplos da taxa de amostragem de 100 Hz, onde o filtro de mediana anti-picos retifica a vibração num viés falso.</w:t>
+      </w:r>
+    </w:p>
+    <w:p>
+      <w:pPr>
+        <w:spacing w:after="200" w:before="0" w:line="360" w:lineRule="auto"/>
+        <w:ind w:firstLine="709"/>
+        <w:jc w:val="both"/>
+      </w:pPr>
+      <w:r>
+        <w:rPr>
+          <w:rFonts w:ascii="Times New Roman" w:cs="Times New Roman" w:eastAsia="Times New Roman" w:hAnsi="Times New Roman"/>
+          <w:sz w:val="24"/>
+          <w:szCs w:val="24"/>
+        </w:rPr>
+        <w:t>Viés que muda com o eixo parado (versão 1.6.15). O segundo ensaio em bancada, com a versão 1.6.14 e giros à mão para posições conhecidas, leu −35,6°, +83,5°, +20,2°, +49,1° e −7,5° para −30°, +90°, +30°, +60° e o retorno a 0° — um erro que cresce com o tempo, e não com o ângulo. O viés do giroscópio muda com o eixo parado (aquecimento nos primeiros minutos após ligar, passeio aleatório), e bastava que mudasse um pouco mais que o limiar baixo entre duas janelas paradas para todas as seguintes serem classificadas como movimento: como janelas de movimento não atualizam o viés, ele nunca mais era corrigido e a diferença era integrada indefinidamente. A versão 1.6.15 acrescenta duas defesas. A primeira reconhece esse caso: seis janelas seguidas sem giro de verdade (todas abaixo de 2 °/s), com médias sobre uma reta lisa e pouco inclinada — ou vinte seguidas abaixo de 1 °/s, critério equivalente ao da versão 1.6.13 —, só podem ser o eixo parado sob um viés que mudou; o viés é então readotado e o que essas janelas integraram é desfeito. A segunda adapta o limiar à estabilidade do próprio giroscópio: o passo da média entre janelas paradas sucessivas é medido continuamente, e o limiar não fica abaixo de quatro vezes esse passo. O fator de suavização do viés passou de 0,1 para 0,3, para que ele acompanhe mais de perto um viés em movimento. O custo é que um giro manual contínuo e muito lento — velocidade quase constante abaixo de cerca de 0,5 °/s por vários segundos, ou abaixo de 1 °/s por mais de 20 s — é indistinguível de um viés que mudou e é descartado.</w:t>
+      </w:r>
+    </w:p>
+    <w:p>
+      <w:pPr>
+        <w:spacing w:after="200" w:before="0" w:line="360" w:lineRule="auto"/>
+        <w:ind w:firstLine="709"/>
+        <w:jc w:val="both"/>
+      </w:pPr>
+      <w:r>
+        <w:rPr>
+          <w:rFonts w:ascii="Times New Roman" w:cs="Times New Roman" w:eastAsia="Times New Roman" w:hAnsi="Times New Roman"/>
+          <w:sz w:val="24"/>
+          <w:szCs w:val="24"/>
+        </w:rPr>
+        <w:t>Leituras espúrias e saturação. Com o fundo de escala do giroscópio ampliado para ±1000 °/s na mesma versão (Tabela 1), um quadro corrompido no barramento I2C que passe pelo teste de plausibilidade do acelerômetro traz uma leitura de giro de até 1000 °/s, e três quadros seguidos venciam o filtro de mediana de cinco amostras. Uma amostra que difere da anterior em mais de 100 °/s — variação fisicamente impossível em 10 ms com o filtro passa-baixa de 21 Hz — passa a ser descartada como leitura falha. O sensor também passou a ser configurado antes de ser retirado do modo de baixo consumo: após uma reinicialização ele volta em ±250 °/s, e, retirado do modo de baixo consumo com uma escrita de configuração falhando, mediria o giro quatro vezes maior que o convertido pelo firmware até a verificação seguinte.</w:t>
       </w:r>
     </w:p>
     <w:tbl>
@@ -7280,7 +7454,7 @@
                 <w:sz w:val="20"/>
                 <w:szCs w:val="20"/>
               </w:rPr>
-              <w:t xml:space="preserve">1,0 °/s</w:t>
+              <w:t>0,1 °/s (piso)</w:t>
             </w:r>
           </w:p>
         </w:tc>
@@ -7308,7 +7482,7 @@
                 <w:sz w:val="20"/>
                 <w:szCs w:val="20"/>
               </w:rPr>
-              <w:t xml:space="preserve">Comparado à distância entre a média de g_y/g_z na janela e o viés de cada eixo (não ao pico)</w:t>
+              <w:t>Comparado à distância entre a média de g_y/g_z na janela e o viés de cada eixo; cresce com a vibração (1,2 × dispersão) e com o passeio do viés (4 × passo entre janelas paradas)</w:t>
             </w:r>
           </w:p>
         </w:tc>
@@ -7366,7 +7540,7 @@
                 <w:sz w:val="20"/>
                 <w:szCs w:val="20"/>
               </w:rPr>
-              <w:t xml:space="preserve">0,1</w:t>
+              <w:t>0,3</w:t>
             </w:r>
           </w:p>
         </w:tc>
@@ -7452,7 +7626,7 @@
                 <w:sz w:val="20"/>
                 <w:szCs w:val="20"/>
               </w:rPr>
-              <w:t xml:space="preserve">1,0 (pendente de calibração)</w:t>
+              <w:t>1,030 (preliminar)</w:t>
             </w:r>
           </w:p>
         </w:tc>
@@ -7480,7 +7654,7 @@
                 <w:sz w:val="20"/>
                 <w:szCs w:val="20"/>
               </w:rPr>
-              <w:t xml:space="preserve">Compensa a tolerância de fábrica do giroscópio (±3%)</w:t>
+              <w:t>Compensa a tolerância de fábrica do giroscópio (±3%); calibração de 2 pontos da versão 1.6.9, a refazer</w:t>
             </w:r>
           </w:p>
         </w:tc>
@@ -7538,7 +7712,7 @@
                 <w:sz w:val="20"/>
                 <w:szCs w:val="20"/>
               </w:rPr>
-              <w:t xml:space="preserve">0,1 s</w:t>
+              <w:t>0,3 s</w:t>
             </w:r>
           </w:p>
         </w:tc>
@@ -7567,6 +7741,178 @@
                 <w:szCs w:val="20"/>
               </w:rPr>
               <w:t xml:space="preserve">Protege contra atrasos anômalos do laço principal</w:t>
+            </w:r>
+          </w:p>
+        </w:tc>
+      </w:tr>
+      <w:tr>
+        <w:tc>
+          <w:tcPr>
+            <w:tcW w:type="dxa" w:w="2900"/>
+            <w:tcMar>
+              <w:top w:type="dxa" w:w="60"/>
+              <w:left w:type="dxa" w:w="100"/>
+              <w:bottom w:type="dxa" w:w="60"/>
+              <w:right w:type="dxa" w:w="100"/>
+            </w:tcMar>
+            <w:vAlign w:val="center"/>
+          </w:tcPr>
+          <w:p>
+            <w:pPr>
+              <w:spacing w:line="240" w:lineRule="auto"/>
+              <w:jc w:val="left"/>
+            </w:pPr>
+            <w:r>
+              <w:rPr>
+                <w:rFonts w:ascii="Times New Roman" w:cs="Times New Roman" w:eastAsia="Times New Roman" w:hAnsi="Times New Roman"/>
+                <w:b w:val="false"/>
+                <w:bCs w:val="false"/>
+                <w:sz w:val="20"/>
+                <w:szCs w:val="20"/>
+              </w:rPr>
+              <w:t>Viés que mudou com o eixo parado</w:t>
+            </w:r>
+          </w:p>
+        </w:tc>
+        <w:tc>
+          <w:tcPr>
+            <w:tcW w:type="dxa" w:w="2700"/>
+            <w:tcMar>
+              <w:top w:type="dxa" w:w="60"/>
+              <w:left w:type="dxa" w:w="100"/>
+              <w:bottom w:type="dxa" w:w="60"/>
+              <w:right w:type="dxa" w:w="100"/>
+            </w:tcMar>
+            <w:vAlign w:val="center"/>
+          </w:tcPr>
+          <w:p>
+            <w:pPr>
+              <w:spacing w:line="240" w:lineRule="auto"/>
+              <w:jc w:val="left"/>
+            </w:pPr>
+            <w:r>
+              <w:rPr>
+                <w:rFonts w:ascii="Times New Roman" w:cs="Times New Roman" w:eastAsia="Times New Roman" w:hAnsi="Times New Roman"/>
+                <w:b w:val="false"/>
+                <w:bCs w:val="false"/>
+                <w:sz w:val="20"/>
+                <w:szCs w:val="20"/>
+              </w:rPr>
+              <w:t>6 janelas lisas ou 20 abaixo de 1,0 °/s</w:t>
+            </w:r>
+          </w:p>
+        </w:tc>
+        <w:tc>
+          <w:tcPr>
+            <w:tcW w:type="dxa" w:w="3400"/>
+            <w:tcMar>
+              <w:top w:type="dxa" w:w="60"/>
+              <w:left w:type="dxa" w:w="100"/>
+              <w:bottom w:type="dxa" w:w="60"/>
+              <w:right w:type="dxa" w:w="100"/>
+            </w:tcMar>
+            <w:vAlign w:val="center"/>
+          </w:tcPr>
+          <w:p>
+            <w:pPr>
+              <w:spacing w:line="240" w:lineRule="auto"/>
+              <w:jc w:val="left"/>
+            </w:pPr>
+            <w:r>
+              <w:rPr>
+                <w:rFonts w:ascii="Times New Roman" w:cs="Times New Roman" w:eastAsia="Times New Roman" w:hAnsi="Times New Roman"/>
+                <w:b w:val="false"/>
+                <w:bCs w:val="false"/>
+                <w:sz w:val="20"/>
+                <w:szCs w:val="20"/>
+              </w:rPr>
+              <w:t>Janelas sem giro que provam o eixo parado sob um viés que mudou (seção 4.2.1)</w:t>
+            </w:r>
+          </w:p>
+        </w:tc>
+      </w:tr>
+      <w:tr>
+        <w:tc>
+          <w:tcPr>
+            <w:tcW w:type="dxa" w:w="2900"/>
+            <w:tcMar>
+              <w:top w:type="dxa" w:w="60"/>
+              <w:left w:type="dxa" w:w="100"/>
+              <w:bottom w:type="dxa" w:w="60"/>
+              <w:right w:type="dxa" w:w="100"/>
+            </w:tcMar>
+            <w:vAlign w:val="center"/>
+          </w:tcPr>
+          <w:p>
+            <w:pPr>
+              <w:spacing w:line="240" w:lineRule="auto"/>
+              <w:jc w:val="left"/>
+            </w:pPr>
+            <w:r>
+              <w:rPr>
+                <w:rFonts w:ascii="Times New Roman" w:cs="Times New Roman" w:eastAsia="Times New Roman" w:hAnsi="Times New Roman"/>
+                <w:b w:val="false"/>
+                <w:bCs w:val="false"/>
+                <w:sz w:val="20"/>
+                <w:szCs w:val="20"/>
+              </w:rPr>
+              <w:t>Descarte por salto</w:t>
+            </w:r>
+          </w:p>
+        </w:tc>
+        <w:tc>
+          <w:tcPr>
+            <w:tcW w:type="dxa" w:w="2700"/>
+            <w:tcMar>
+              <w:top w:type="dxa" w:w="60"/>
+              <w:left w:type="dxa" w:w="100"/>
+              <w:bottom w:type="dxa" w:w="60"/>
+              <w:right w:type="dxa" w:w="100"/>
+            </w:tcMar>
+            <w:vAlign w:val="center"/>
+          </w:tcPr>
+          <w:p>
+            <w:pPr>
+              <w:spacing w:line="240" w:lineRule="auto"/>
+              <w:jc w:val="left"/>
+            </w:pPr>
+            <w:r>
+              <w:rPr>
+                <w:rFonts w:ascii="Times New Roman" w:cs="Times New Roman" w:eastAsia="Times New Roman" w:hAnsi="Times New Roman"/>
+                <w:b w:val="false"/>
+                <w:bCs w:val="false"/>
+                <w:sz w:val="20"/>
+                <w:szCs w:val="20"/>
+              </w:rPr>
+              <w:t>100 °/s por amostra</w:t>
+            </w:r>
+          </w:p>
+        </w:tc>
+        <w:tc>
+          <w:tcPr>
+            <w:tcW w:type="dxa" w:w="3400"/>
+            <w:tcMar>
+              <w:top w:type="dxa" w:w="60"/>
+              <w:left w:type="dxa" w:w="100"/>
+              <w:bottom w:type="dxa" w:w="60"/>
+              <w:right w:type="dxa" w:w="100"/>
+            </w:tcMar>
+            <w:vAlign w:val="center"/>
+          </w:tcPr>
+          <w:p>
+            <w:pPr>
+              <w:spacing w:line="240" w:lineRule="auto"/>
+              <w:jc w:val="left"/>
+            </w:pPr>
+            <w:r>
+              <w:rPr>
+                <w:rFonts w:ascii="Times New Roman" w:cs="Times New Roman" w:eastAsia="Times New Roman" w:hAnsi="Times New Roman"/>
+                <w:b w:val="false"/>
+                <w:bCs w:val="false"/>
+                <w:sz w:val="20"/>
+                <w:szCs w:val="20"/>
+              </w:rPr>
+              <w:t>Variação máxima entre amostras de 10 ms; acima disso, leitura corrompida</w:t>
             </w:r>
           </w:p>
         </w:tc>
@@ -7643,7 +7989,7 @@
           <w:sz w:val="24"/>
           <w:szCs w:val="24"/>
         </w:rPr>
-        <w:t xml:space="preserve">ou seja, o erro de escala é proporcional ao deslocamento atual em relação ao zero calibrado, e não se acumula com o tempo nem com o número de movimentos realizados — ele é limitado pelo curso mecânico do eixo e desaparece quando o eixo retorna à posição zero. A correção definitiva (PAN_SCALE_CORRECTION, hoje fixada em 1,0) depende de uma calibração de bancada: girar o eixo entre duas posições de separação angular conhecida e calcular a razão entre o ângulo real e o ângulo integrado.</w:t>
+        <w:t>ou seja, o erro de escala é proporcional ao deslocamento atual em relação ao zero calibrado, e não se acumula com o tempo nem com o número de movimentos realizados — ele é limitado pelo curso mecânico do eixo e desaparece quando o eixo retorna à posição zero. A correção definitiva (PAN_SCALE_CORRECTION, hoje em 1,030 — calibração preliminar de dois pontos feita na versão 1.6.9, antes das correções das versões 1.6.14 e 1.6.15, e que deve ser refeita) depende de uma calibração de bancada: girar o eixo entre duas posições de separação angular conhecida e calcular a razão entre o ângulo real e o ângulo integrado.</w:t>
       </w:r>
     </w:p>
     <w:p>
@@ -11491,7 +11837,7 @@
                 <w:sz w:val="20"/>
                 <w:szCs w:val="20"/>
               </w:rPr>
-              <w:t xml:space="preserve">60,02° (sem compensação de tilt, o resultado seria 30°)</w:t>
+              <w:t>60,02° na versão 1.6.15 (sem compensação de tilt, o resultado seria 30°; com o sinal invertido das versões até a 1.6.14, −30°)</w:t>
             </w:r>
           </w:p>
         </w:tc>
@@ -11724,6 +12070,296 @@
                 <w:szCs w:val="20"/>
               </w:rPr>
               <w:t xml:space="preserve">29,77° mantidos</w:t>
+            </w:r>
+          </w:p>
+        </w:tc>
+      </w:tr>
+      <w:tr>
+        <w:tc>
+          <w:tcPr>
+            <w:tcW w:type="dxa" w:w="4700"/>
+            <w:tcMar>
+              <w:top w:type="dxa" w:w="60"/>
+              <w:left w:type="dxa" w:w="100"/>
+              <w:bottom w:type="dxa" w:w="60"/>
+              <w:right w:type="dxa" w:w="100"/>
+            </w:tcMar>
+            <w:vAlign w:val="center"/>
+          </w:tcPr>
+          <w:p>
+            <w:pPr>
+              <w:spacing w:line="240" w:lineRule="auto"/>
+              <w:jc w:val="left"/>
+            </w:pPr>
+            <w:r>
+              <w:rPr>
+                <w:rFonts w:ascii="Times New Roman" w:cs="Times New Roman" w:eastAsia="Times New Roman" w:hAnsi="Times New Roman"/>
+                <w:b w:val="false"/>
+                <w:bCs w:val="false"/>
+                <w:sz w:val="20"/>
+                <w:szCs w:val="20"/>
+              </w:rPr>
+              <w:t>Giro à mão de +8° em 16 s (pico de 1 °/s) — v1.6.14</w:t>
+            </w:r>
+          </w:p>
+        </w:tc>
+        <w:tc>
+          <w:tcPr>
+            <w:tcW w:type="dxa" w:w="4300"/>
+            <w:tcMar>
+              <w:top w:type="dxa" w:w="60"/>
+              <w:left w:type="dxa" w:w="100"/>
+              <w:bottom w:type="dxa" w:w="60"/>
+              <w:right w:type="dxa" w:w="100"/>
+            </w:tcMar>
+            <w:vAlign w:val="center"/>
+          </w:tcPr>
+          <w:p>
+            <w:pPr>
+              <w:spacing w:line="240" w:lineRule="auto"/>
+              <w:jc w:val="left"/>
+            </w:pPr>
+            <w:r>
+              <w:rPr>
+                <w:rFonts w:ascii="Times New Roman" w:cs="Times New Roman" w:eastAsia="Times New Roman" w:hAnsi="Times New Roman"/>
+                <w:b w:val="false"/>
+                <w:bCs w:val="false"/>
+                <w:sz w:val="20"/>
+                <w:szCs w:val="20"/>
+              </w:rPr>
+              <w:t>7,9° (na versão 1.6.13: 0,00°, com excursão até −0,64°)</w:t>
+            </w:r>
+          </w:p>
+        </w:tc>
+      </w:tr>
+      <w:tr>
+        <w:tc>
+          <w:tcPr>
+            <w:tcW w:type="dxa" w:w="4700"/>
+            <w:tcMar>
+              <w:top w:type="dxa" w:w="60"/>
+              <w:left w:type="dxa" w:w="100"/>
+              <w:bottom w:type="dxa" w:w="60"/>
+              <w:right w:type="dxa" w:w="100"/>
+            </w:tcMar>
+            <w:vAlign w:val="center"/>
+          </w:tcPr>
+          <w:p>
+            <w:pPr>
+              <w:spacing w:line="240" w:lineRule="auto"/>
+              <w:jc w:val="left"/>
+            </w:pPr>
+            <w:r>
+              <w:rPr>
+                <w:rFonts w:ascii="Times New Roman" w:cs="Times New Roman" w:eastAsia="Times New Roman" w:hAnsi="Times New Roman"/>
+                <w:b w:val="false"/>
+                <w:bCs w:val="false"/>
+                <w:sz w:val="20"/>
+                <w:szCs w:val="20"/>
+              </w:rPr>
+              <w:t>Oito passos à mão de +1° — v1.6.14</w:t>
+            </w:r>
+          </w:p>
+        </w:tc>
+        <w:tc>
+          <w:tcPr>
+            <w:tcW w:type="dxa" w:w="4300"/>
+            <w:tcMar>
+              <w:top w:type="dxa" w:w="60"/>
+              <w:left w:type="dxa" w:w="100"/>
+              <w:bottom w:type="dxa" w:w="60"/>
+              <w:right w:type="dxa" w:w="100"/>
+            </w:tcMar>
+            <w:vAlign w:val="center"/>
+          </w:tcPr>
+          <w:p>
+            <w:pPr>
+              <w:spacing w:line="240" w:lineRule="auto"/>
+              <w:jc w:val="left"/>
+            </w:pPr>
+            <w:r>
+              <w:rPr>
+                <w:rFonts w:ascii="Times New Roman" w:cs="Times New Roman" w:eastAsia="Times New Roman" w:hAnsi="Times New Roman"/>
+                <w:b w:val="false"/>
+                <w:bCs w:val="false"/>
+                <w:sz w:val="20"/>
+                <w:szCs w:val="20"/>
+              </w:rPr>
+              <w:t>8,00° (na versão 1.6.13: 0,00°)</w:t>
+            </w:r>
+          </w:p>
+        </w:tc>
+      </w:tr>
+      <w:tr>
+        <w:tc>
+          <w:tcPr>
+            <w:tcW w:type="dxa" w:w="4700"/>
+            <w:tcMar>
+              <w:top w:type="dxa" w:w="60"/>
+              <w:left w:type="dxa" w:w="100"/>
+              <w:bottom w:type="dxa" w:w="60"/>
+              <w:right w:type="dxa" w:w="100"/>
+            </w:tcMar>
+            <w:vAlign w:val="center"/>
+          </w:tcPr>
+          <w:p>
+            <w:pPr>
+              <w:spacing w:line="240" w:lineRule="auto"/>
+              <w:jc w:val="left"/>
+            </w:pPr>
+            <w:r>
+              <w:rPr>
+                <w:rFonts w:ascii="Times New Roman" w:cs="Times New Roman" w:eastAsia="Times New Roman" w:hAnsi="Times New Roman"/>
+                <w:b w:val="false"/>
+                <w:bCs w:val="false"/>
+                <w:sz w:val="20"/>
+                <w:szCs w:val="20"/>
+              </w:rPr>
+              <w:t>Ensaio de bancada −30°/+90°/+30°/+60°/0° com o viés do giroscópio em passeio aleatório — v1.6.15</w:t>
+            </w:r>
+          </w:p>
+        </w:tc>
+        <w:tc>
+          <w:tcPr>
+            <w:tcW w:type="dxa" w:w="4300"/>
+            <w:tcMar>
+              <w:top w:type="dxa" w:w="60"/>
+              <w:left w:type="dxa" w:w="100"/>
+              <w:bottom w:type="dxa" w:w="60"/>
+              <w:right w:type="dxa" w:w="100"/>
+            </w:tcMar>
+            <w:vAlign w:val="center"/>
+          </w:tcPr>
+          <w:p>
+            <w:pPr>
+              <w:spacing w:line="240" w:lineRule="auto"/>
+              <w:jc w:val="left"/>
+            </w:pPr>
+            <w:r>
+              <w:rPr>
+                <w:rFonts w:ascii="Times New Roman" w:cs="Times New Roman" w:eastAsia="Times New Roman" w:hAnsi="Times New Roman"/>
+                <w:b w:val="false"/>
+                <w:bCs w:val="false"/>
+                <w:sz w:val="20"/>
+                <w:szCs w:val="20"/>
+              </w:rPr>
+              <w:t>Pior erro de 0,17° (na versão 1.6.14: 3,8°)</w:t>
+            </w:r>
+          </w:p>
+        </w:tc>
+      </w:tr>
+      <w:tr>
+        <w:tc>
+          <w:tcPr>
+            <w:tcW w:type="dxa" w:w="4700"/>
+            <w:tcMar>
+              <w:top w:type="dxa" w:w="60"/>
+              <w:left w:type="dxa" w:w="100"/>
+              <w:bottom w:type="dxa" w:w="60"/>
+              <w:right w:type="dxa" w:w="100"/>
+            </w:tcMar>
+            <w:vAlign w:val="center"/>
+          </w:tcPr>
+          <w:p>
+            <w:pPr>
+              <w:spacing w:line="240" w:lineRule="auto"/>
+              <w:jc w:val="left"/>
+            </w:pPr>
+            <w:r>
+              <w:rPr>
+                <w:rFonts w:ascii="Times New Roman" w:cs="Times New Roman" w:eastAsia="Times New Roman" w:hAnsi="Times New Roman"/>
+                <w:b w:val="false"/>
+                <w:bCs w:val="false"/>
+                <w:sz w:val="20"/>
+                <w:szCs w:val="20"/>
+              </w:rPr>
+              <w:t>Mesmo ensaio logo após ligar, com o viés variando 2 °/s em cerca de 1 min — v1.6.15</w:t>
+            </w:r>
+          </w:p>
+        </w:tc>
+        <w:tc>
+          <w:tcPr>
+            <w:tcW w:type="dxa" w:w="4300"/>
+            <w:tcMar>
+              <w:top w:type="dxa" w:w="60"/>
+              <w:left w:type="dxa" w:w="100"/>
+              <w:bottom w:type="dxa" w:w="60"/>
+              <w:right w:type="dxa" w:w="100"/>
+            </w:tcMar>
+            <w:vAlign w:val="center"/>
+          </w:tcPr>
+          <w:p>
+            <w:pPr>
+              <w:spacing w:line="240" w:lineRule="auto"/>
+              <w:jc w:val="left"/>
+            </w:pPr>
+            <w:r>
+              <w:rPr>
+                <w:rFonts w:ascii="Times New Roman" w:cs="Times New Roman" w:eastAsia="Times New Roman" w:hAnsi="Times New Roman"/>
+                <w:b w:val="false"/>
+                <w:bCs w:val="false"/>
+                <w:sz w:val="20"/>
+                <w:szCs w:val="20"/>
+              </w:rPr>
+              <w:t>Pior erro de 0,10° (na versão 1.6.14: 54°)</w:t>
+            </w:r>
+          </w:p>
+        </w:tc>
+      </w:tr>
+      <w:tr>
+        <w:tc>
+          <w:tcPr>
+            <w:tcW w:type="dxa" w:w="4700"/>
+            <w:tcMar>
+              <w:top w:type="dxa" w:w="60"/>
+              <w:left w:type="dxa" w:w="100"/>
+              <w:bottom w:type="dxa" w:w="60"/>
+              <w:right w:type="dxa" w:w="100"/>
+            </w:tcMar>
+            <w:vAlign w:val="center"/>
+          </w:tcPr>
+          <w:p>
+            <w:pPr>
+              <w:spacing w:line="240" w:lineRule="auto"/>
+              <w:jc w:val="left"/>
+            </w:pPr>
+            <w:r>
+              <w:rPr>
+                <w:rFonts w:ascii="Times New Roman" w:cs="Times New Roman" w:eastAsia="Times New Roman" w:hAnsi="Times New Roman"/>
+                <w:b w:val="false"/>
+                <w:bCs w:val="false"/>
+                <w:sz w:val="20"/>
+                <w:szCs w:val="20"/>
+              </w:rPr>
+              <w:t>Inclinação fixa de 30°, azimute +40° — v1.6.15</w:t>
+            </w:r>
+          </w:p>
+        </w:tc>
+        <w:tc>
+          <w:tcPr>
+            <w:tcW w:type="dxa" w:w="4300"/>
+            <w:tcMar>
+              <w:top w:type="dxa" w:w="60"/>
+              <w:left w:type="dxa" w:w="100"/>
+              <w:bottom w:type="dxa" w:w="60"/>
+              <w:right w:type="dxa" w:w="100"/>
+            </w:tcMar>
+            <w:vAlign w:val="center"/>
+          </w:tcPr>
+          <w:p>
+            <w:pPr>
+              <w:spacing w:line="240" w:lineRule="auto"/>
+              <w:jc w:val="left"/>
+            </w:pPr>
+            <w:r>
+              <w:rPr>
+                <w:rFonts w:ascii="Times New Roman" w:cs="Times New Roman" w:eastAsia="Times New Roman" w:hAnsi="Times New Roman"/>
+                <w:b w:val="false"/>
+                <w:bCs w:val="false"/>
+                <w:sz w:val="20"/>
+                <w:szCs w:val="20"/>
+              </w:rPr>
+              <w:t>40,02° (na versão 1.6.14: 20,0°)</w:t>
             </w:r>
           </w:p>
         </w:tc>
@@ -11755,7 +12391,22 @@
           <w:sz w:val="24"/>
           <w:szCs w:val="24"/>
         </w:rPr>
-        <w:t xml:space="preserve">O piso de detecção observado nos testes correspondeu ao previsto pelo produto limiar × janela (seção 4.2.1): movimentos de até aproximadamente 1° foram descartados como ruído, e movimentos a partir de aproximadamente 2° foram preservados integralmente. As três últimas linhas foram acrescentadas nesta revisão, depois que o defeito de viés dependente da inclinação (seção 4.2.1) foi observado em bancada: os cenários originais, todos com inclinação fixa durante o teste, não o exercitavam. Os cenários estão automatizados em sim/pan_sim.cpp, executado pelo script sim/run.sh. Ressalta-se que esses resultados validam a correção matemática do algoritmo, e não seu comportamento contra o sensor físico real — validação que permanece pendente (seção 7.4).</w:t>
+        <w:t>Até a versão 1.6.13, o piso de detecção observado correspondeu ao previsto pelo produto limiar × janela (seção 4.2.1): movimentos de até aproximadamente 1° eram descartados como ruído, e movimentos a partir de aproximadamente 2° eram preservados integralmente; desde a versão 1.6.14 o piso é de cerca de 0,1° para um movimento isolado. As três linhas marcadas "v1.6.1" foram acrescentadas na revisão 03, depois que o defeito de viés dependente da inclinação (seção 4.2.1) foi observado em bancada: os cenários originais, todos com inclinação fixa durante o teste, não o exercitavam. Os cenários estão automatizados em sim/pan_sim.cpp, executado pelo script sim/run.sh. Ressalta-se que esses resultados validam a correção matemática do algoritmo, e não seu comportamento contra o sensor físico real — validação que permanece pendente (seção 7.4).</w:t>
+      </w:r>
+    </w:p>
+    <w:p>
+      <w:pPr>
+        <w:spacing w:after="200" w:before="0" w:line="360" w:lineRule="auto"/>
+        <w:ind w:firstLine="709"/>
+        <w:jc w:val="both"/>
+      </w:pPr>
+      <w:r>
+        <w:rPr>
+          <w:rFonts w:ascii="Times New Roman" w:cs="Times New Roman" w:eastAsia="Times New Roman" w:hAnsi="Times New Roman"/>
+          <w:sz w:val="24"/>
+          <w:szCs w:val="24"/>
+        </w:rPr>
+        <w:t>As cinco últimas linhas da Tabela 8 vêm das versões 1.6.14 e 1.6.15. As do ensaio de bancada reproduzem o segundo ensaio físico (seção 4.2.1), em que a versão 1.6.14 errou até 10,9°; a última confirma a correção do sinal da compensação de tilt, que os cenários anteriores não detectavam porque o sensor simulado tinha o mesmo sinal invertido do firmware — desde a versão 1.6.15 os simuladores geram as leituras pela física. Em uma avaliação com 20 sementes aleatórias do mesmo ensaio, com filtro passa-baixa, quantização e saturação do sensor, o pior erro das cinco leituras ficou em 0,07° (percentil 90) com o giroscópio estável, inclusive a 30° de inclinação; com o viés em passeio aleatório de 0,02 a 0,03 °/s/√s, entre 0,45° e 0,88°; e logo após ligar, 0,29°. No ensaio de resistência de 100 sementes (motor, deriva térmica, vibração e falhas de hardware injetadas), a mediana do pior erro foi de 0,30° e o pior caso, de 1,05°.</w:t>
       </w:r>
     </w:p>
     <w:p>
@@ -12289,7 +12940,7 @@
           <w:sz w:val="24"/>
           <w:szCs w:val="24"/>
         </w:rPr>
-        <w:t xml:space="preserve">• Orientação de montagem do sensor: a fórmula de inclinação (atan2 sobre os eixos Y e Z) e a de compensação de tilt do azimute assumem uma orientação específica de montagem do MPU6050 (eixo X alinhado ao eixo mecânico de giro), recomendada mas ainda não confirmada fisicamente por um ensaio de bancada.</w:t>
+        <w:t>• Orientação de montagem do sensor: a fórmula de inclinação (atan2 sobre os eixos Y e Z) e a de compensação de tilt do azimute assumem que o eixo X do MPU6050 está alinhado ao eixo mecânico de tilt, orientação recomendada mas ainda não confirmada fisicamente por um ensaio de bancada.</w:t>
       </w:r>
     </w:p>
     <w:p>
@@ -12303,7 +12954,7 @@
           <w:sz w:val="24"/>
           <w:szCs w:val="24"/>
         </w:rPr>
-        <w:t xml:space="preserve">• Sinal do termo de compensação de tilt (−g_y·sen θ): depende da lateralidade (handedness) real da montagem física; próximo de θ = 0° esse termo se anula, de modo que um sinal invertido não se manifestaria nos testes realizados com a inclinação zerada — é necessário testar o azimute com a inclinação em ±45°/±60° para confirmar o sinal.</w:t>
+        <w:t>• Compensação de tilt do azimute (sinal corrigido na v1.6.15 — seção 4.2): por ser o produto escalar da vertical medida pelo acelerômetro com a velocidade angular medida pelo giroscópio, nos mesmos eixos do chip, não depende da lateralidade (handedness) da montagem; a confirmação em bancada está pendente — o mesmo giro de azimute com a inclinação em 0° e em ±30°/±45° deve resultar no mesmo ângulo.</w:t>
       </w:r>
     </w:p>
     <w:p>
@@ -12317,7 +12968,35 @@
           <w:sz w:val="24"/>
           <w:szCs w:val="24"/>
         </w:rPr>
-        <w:t xml:space="preserve">• Fator de escala do giroscópio (PAN_SCALE_CORRECTION): permanece fixado em 1,0, pendente de uma calibração de bancada entre duas posições de separação angular conhecida; até então, subsiste a tolerância de fábrica do giroscópio (aproximadamente ±3%).</w:t>
+        <w:t>• Fator de escala do giroscópio (PAN_SCALE_CORRECTION): 1,030, calibração preliminar de dois pontos feita na versão 1.6.9, antes das correções das versões 1.6.14 e 1.6.15; deve ser refeita com giros de 90° com a inclinação em 0°. Até lá, subsiste parte da tolerância de fábrica do giroscópio (aproximadamente ±3%).</w:t>
+      </w:r>
+    </w:p>
+    <w:p>
+      <w:pPr>
+        <w:spacing w:after="140" w:line="360" w:lineRule="auto"/>
+        <w:ind w:left="700" w:hanging="300"/>
+      </w:pPr>
+      <w:r>
+        <w:rPr>
+          <w:rFonts w:ascii="Times New Roman" w:cs="Times New Roman" w:eastAsia="Times New Roman" w:hAnsi="Times New Roman"/>
+          <w:sz w:val="24"/>
+          <w:szCs w:val="24"/>
+        </w:rPr>
+        <w:t>• Azimute sob variação do viés do giroscópio (v1.6.15 — seção 4.2.1): validado em simulação; a repetir em bancada o ensaio −30°/+90°/+30°/+60°/0°, ligando a placa 1 a 2 min antes de calibrar e girando em poucos segundos.</w:t>
+      </w:r>
+    </w:p>
+    <w:p>
+      <w:pPr>
+        <w:spacing w:after="140" w:line="360" w:lineRule="auto"/>
+        <w:ind w:left="700" w:hanging="300"/>
+      </w:pPr>
+      <w:r>
+        <w:rPr>
+          <w:rFonts w:ascii="Times New Roman" w:cs="Times New Roman" w:eastAsia="Times New Roman" w:hAnsi="Times New Roman"/>
+          <w:sz w:val="24"/>
+          <w:szCs w:val="24"/>
+        </w:rPr>
+        <w:t>• Giro manual contínuo e muito lento (seção 4.2.1): abaixo de cerca de 0,5 °/s por vários segundos, ou abaixo de 1 °/s por mais de cerca de 20 s, é tomado como variação do viés e descartado — limite inerente a distinguir, só pelo giroscópio, um movimento lento de um viés que mudou.</w:t>
       </w:r>
     </w:p>
     <w:p>
@@ -12476,7 +13155,7 @@
           <w:sz w:val="24"/>
           <w:szCs w:val="24"/>
         </w:rPr>
-        <w:t xml:space="preserve">O primeiro ensaio em bancada, com o firmware gravado em um ESP32 físico, expôs dois defeitos que as simulações anteriores não cobriam — o viés do azimute dependente da inclinação e o orçamento de handles do serviço BLE —, ambos corrigidos na versão 1.6.1 e agora reproduzidos por testes automatizados (seções 7.1 e 7.3). O episódio reforça o valor do ensaio físico e, ao mesmo tempo, o de transformar cada defeito encontrado em um caso de teste permanente.</w:t>
+        <w:t>O primeiro ensaio em bancada, com o firmware gravado em um ESP32 físico, expôs dois defeitos que as simulações anteriores não cobriam — o viés do azimute dependente da inclinação e o orçamento de handles do serviço BLE —, ambos corrigidos na versão 1.6.1 e agora reproduzidos por testes automatizados (seções 7.1 e 7.3). O episódio reforça o valor do ensaio físico e, ao mesmo tempo, o de transformar cada defeito encontrado em um caso de teste permanente. O segundo ensaio, com giros de azimute à mão, expôs a variação do viés do giroscópio com o eixo parado e, ao ser reproduzido em simulação com a física correta do sensor, um sinal invertido na compensação de tilt presente desde a versão 1.2.0 — ambos corrigidos na versão 1.6.15.</w:t>
       </w:r>
     </w:p>
     <w:p>
@@ -12491,7 +13170,7 @@
           <w:sz w:val="24"/>
           <w:szCs w:val="24"/>
         </w:rPr>
-        <w:t xml:space="preserve">Os próximos passos naturais do projeto são as validações listadas na seção 7.4 — em particular, a confirmação da orientação de montagem do sensor, a calibração do fator de escala do giroscópio e a validação com o sensor montado no pan-tilt —, sem as quais o sistema, já verificado em bancada, ainda não deve ser considerado validado para uso em campo.</w:t>
+        <w:t>Os próximos passos naturais do projeto são as validações listadas na seção 7.4 — em particular, a confirmação da orientação de montagem do sensor e da compensação de tilt, a repetição do ensaio de azimute à mão, a recalibração do fator de escala do giroscópio e a validação com o sensor montado no pan-tilt —, sem as quais o sistema, já verificado em bancada, ainda não deve ser considerado validado para uso em campo.</w:t>
       </w:r>
     </w:p>
     <w:p>

</xml_diff>